<commit_message>
vault backup: 2026-03-06 11:04:45
</commit_message>
<xml_diff>
--- a/ПР и ЛБ/АРХ ПРУЧ1.docx
+++ b/ПР и ЛБ/АРХ ПРУЧ1.docx
@@ -2183,19 +2183,7 @@
                   <w:szCs w:val="28"/>
                   <w:lang w:val="en-US"/>
                 </w:rPr>
-                <m:t>b</m:t>
-              </m:r>
-              <m:r>
-                <m:rPr>
-                  <m:sty m:val="p"/>
-                </m:rPr>
-                <w:rPr>
-                  <w:rFonts w:ascii="Cambria Math" w:eastAsiaTheme="minorEastAsia" w:hAnsi="Cambria Math" w:cs="Times New Roman"/>
-                  <w:sz w:val="28"/>
-                  <w:szCs w:val="28"/>
-                  <w:lang w:val="en-US"/>
-                </w:rPr>
-                <m:t>,</m:t>
+                <m:t>b,</m:t>
               </m:r>
               <m:r>
                 <w:rPr>
@@ -5872,6 +5860,174 @@
     </w:p>
     <w:p>
       <w:pPr>
+        <w:spacing w:line="360" w:lineRule="auto"/>
+        <w:jc w:val="both"/>
+        <w:rPr>
+          <w:rFonts w:ascii="Times New Roman" w:hAnsi="Times New Roman" w:cs="Times New Roman"/>
+          <w:bCs/>
+          <w:sz w:val="28"/>
+          <w:szCs w:val="28"/>
+        </w:rPr>
+      </w:pPr>
+      <w:r>
+        <w:rPr>
+          <w:rFonts w:ascii="Times New Roman" w:hAnsi="Times New Roman" w:cs="Times New Roman"/>
+          <w:sz w:val="28"/>
+          <w:szCs w:val="28"/>
+        </w:rPr>
+        <w:lastRenderedPageBreak/>
+        <w:t xml:space="preserve">На рисунке </w:t>
+      </w:r>
+      <w:r>
+        <w:rPr>
+          <w:rFonts w:ascii="Times New Roman" w:hAnsi="Times New Roman" w:cs="Times New Roman"/>
+          <w:sz w:val="28"/>
+          <w:szCs w:val="28"/>
+        </w:rPr>
+        <w:t>2</w:t>
+      </w:r>
+      <w:r>
+        <w:rPr>
+          <w:rFonts w:ascii="Times New Roman" w:hAnsi="Times New Roman" w:cs="Times New Roman"/>
+          <w:sz w:val="28"/>
+          <w:szCs w:val="28"/>
+        </w:rPr>
+        <w:t xml:space="preserve"> показана </w:t>
+      </w:r>
+      <w:r>
+        <w:rPr>
+          <w:rFonts w:ascii="Times New Roman" w:hAnsi="Times New Roman" w:cs="Times New Roman"/>
+          <w:bCs/>
+          <w:sz w:val="28"/>
+          <w:szCs w:val="28"/>
+        </w:rPr>
+        <w:t xml:space="preserve">схема функции </w:t>
+      </w:r>
+      <w:r>
+        <w:rPr>
+          <w:rFonts w:ascii="Times New Roman" w:hAnsi="Times New Roman" w:cs="Times New Roman"/>
+          <w:bCs/>
+          <w:sz w:val="28"/>
+          <w:szCs w:val="28"/>
+          <w:lang w:val="en-US"/>
+        </w:rPr>
+        <w:t>y</w:t>
+      </w:r>
+      <w:r>
+        <w:rPr>
+          <w:rFonts w:ascii="Times New Roman" w:hAnsi="Times New Roman" w:cs="Times New Roman"/>
+          <w:bCs/>
+          <w:sz w:val="28"/>
+          <w:szCs w:val="28"/>
+        </w:rPr>
+        <w:t xml:space="preserve"> в СДНФ</w:t>
+      </w:r>
+    </w:p>
+    <w:p>
+      <w:pPr>
+        <w:spacing w:line="360" w:lineRule="auto"/>
+        <w:jc w:val="center"/>
+        <w:rPr>
+          <w:rFonts w:ascii="Times New Roman" w:hAnsi="Times New Roman" w:cs="Times New Roman"/>
+          <w:sz w:val="28"/>
+          <w:szCs w:val="28"/>
+        </w:rPr>
+      </w:pPr>
+      <w:r>
+        <w:rPr>
+          <w:noProof/>
+        </w:rPr>
+        <w:drawing>
+          <wp:inline distT="0" distB="0" distL="0" distR="0" wp14:anchorId="741B1B6A" wp14:editId="3AE32718">
+            <wp:extent cx="4427220" cy="4531807"/>
+            <wp:effectExtent l="0" t="0" r="0" b="2540"/>
+            <wp:docPr id="1" name="Рисунок 1"/>
+            <wp:cNvGraphicFramePr>
+              <a:graphicFrameLocks xmlns:a="http://schemas.openxmlformats.org/drawingml/2006/main" noChangeAspect="1"/>
+            </wp:cNvGraphicFramePr>
+            <a:graphic xmlns:a="http://schemas.openxmlformats.org/drawingml/2006/main">
+              <a:graphicData uri="http://schemas.openxmlformats.org/drawingml/2006/picture">
+                <pic:pic xmlns:pic="http://schemas.openxmlformats.org/drawingml/2006/picture">
+                  <pic:nvPicPr>
+                    <pic:cNvPr id="1" name=""/>
+                    <pic:cNvPicPr/>
+                  </pic:nvPicPr>
+                  <pic:blipFill>
+                    <a:blip r:embed="rId7"/>
+                    <a:stretch>
+                      <a:fillRect/>
+                    </a:stretch>
+                  </pic:blipFill>
+                  <pic:spPr>
+                    <a:xfrm>
+                      <a:off x="0" y="0"/>
+                      <a:ext cx="4428458" cy="4533074"/>
+                    </a:xfrm>
+                    <a:prstGeom prst="rect">
+                      <a:avLst/>
+                    </a:prstGeom>
+                  </pic:spPr>
+                </pic:pic>
+              </a:graphicData>
+            </a:graphic>
+          </wp:inline>
+        </w:drawing>
+      </w:r>
+    </w:p>
+    <w:p>
+      <w:pPr>
+        <w:spacing w:line="360" w:lineRule="auto"/>
+        <w:jc w:val="center"/>
+        <w:rPr>
+          <w:rFonts w:ascii="Times New Roman" w:hAnsi="Times New Roman" w:cs="Times New Roman"/>
+          <w:sz w:val="28"/>
+          <w:szCs w:val="28"/>
+        </w:rPr>
+      </w:pPr>
+      <w:r>
+        <w:rPr>
+          <w:rFonts w:ascii="Times New Roman" w:hAnsi="Times New Roman" w:cs="Times New Roman"/>
+          <w:sz w:val="28"/>
+          <w:szCs w:val="28"/>
+        </w:rPr>
+        <w:t xml:space="preserve">Рисунок </w:t>
+      </w:r>
+      <w:r>
+        <w:rPr>
+          <w:rFonts w:ascii="Times New Roman" w:hAnsi="Times New Roman" w:cs="Times New Roman"/>
+          <w:sz w:val="28"/>
+          <w:szCs w:val="28"/>
+        </w:rPr>
+        <w:t>2</w:t>
+      </w:r>
+      <w:r>
+        <w:rPr>
+          <w:rFonts w:ascii="Times New Roman" w:hAnsi="Times New Roman" w:cs="Times New Roman"/>
+          <w:sz w:val="28"/>
+          <w:szCs w:val="28"/>
+        </w:rPr>
+        <w:t xml:space="preserve"> –– Схема функции </w:t>
+      </w:r>
+      <w:r>
+        <w:rPr>
+          <w:rFonts w:ascii="Times New Roman" w:hAnsi="Times New Roman" w:cs="Times New Roman"/>
+          <w:sz w:val="28"/>
+          <w:szCs w:val="28"/>
+          <w:lang w:val="en-US"/>
+        </w:rPr>
+        <w:t>y</w:t>
+      </w:r>
+      <w:r>
+        <w:rPr>
+          <w:rFonts w:ascii="Times New Roman" w:hAnsi="Times New Roman" w:cs="Times New Roman"/>
+          <w:sz w:val="28"/>
+          <w:szCs w:val="28"/>
+        </w:rPr>
+        <w:t xml:space="preserve"> в СДНФ</w:t>
+      </w:r>
+    </w:p>
+    <w:p>
+      <w:pPr>
         <w:pStyle w:val="a7"/>
         <w:numPr>
           <w:ilvl w:val="0"/>
@@ -5892,7 +6048,6 @@
           <w:sz w:val="28"/>
           <w:szCs w:val="28"/>
         </w:rPr>
-        <w:lastRenderedPageBreak/>
         <w:t xml:space="preserve">Запись </w:t>
       </w:r>
       <w:r>
@@ -6443,6 +6598,25 @@
     </w:p>
     <w:p>
       <w:pPr>
+        <w:rPr>
+          <w:rFonts w:ascii="Cambria Math" w:eastAsiaTheme="minorEastAsia" w:hAnsi="Cambria Math" w:cs="Times New Roman"/>
+          <w:sz w:val="28"/>
+          <w:szCs w:val="28"/>
+          <w:lang w:val="en-US"/>
+        </w:rPr>
+      </w:pPr>
+      <w:r>
+        <w:rPr>
+          <w:rFonts w:ascii="Cambria Math" w:eastAsiaTheme="minorEastAsia" w:hAnsi="Cambria Math" w:cs="Times New Roman"/>
+          <w:sz w:val="28"/>
+          <w:szCs w:val="28"/>
+          <w:lang w:val="en-US"/>
+        </w:rPr>
+        <w:br w:type="page"/>
+      </w:r>
+    </w:p>
+    <w:p>
+      <w:pPr>
         <w:pStyle w:val="a7"/>
         <w:spacing w:line="360" w:lineRule="auto"/>
         <w:ind w:left="1069"/>
@@ -6454,8 +6628,149 @@
         </w:rPr>
       </w:pPr>
     </w:p>
+    <w:p>
+      <w:pPr>
+        <w:spacing w:line="360" w:lineRule="auto"/>
+        <w:ind w:firstLine="708"/>
+        <w:jc w:val="both"/>
+        <w:rPr>
+          <w:rFonts w:ascii="Cambria Math" w:eastAsiaTheme="minorEastAsia" w:hAnsi="Cambria Math" w:cs="Times New Roman"/>
+          <w:sz w:val="28"/>
+          <w:szCs w:val="28"/>
+        </w:rPr>
+      </w:pPr>
+      <w:r>
+        <w:rPr>
+          <w:rFonts w:ascii="Cambria Math" w:eastAsiaTheme="minorEastAsia" w:hAnsi="Cambria Math" w:cs="Times New Roman"/>
+          <w:bCs/>
+          <w:sz w:val="28"/>
+          <w:szCs w:val="28"/>
+        </w:rPr>
+        <w:t xml:space="preserve">Ниже на рисунке 3 показана схема функции </w:t>
+      </w:r>
+      <w:r>
+        <w:rPr>
+          <w:rFonts w:ascii="Cambria Math" w:eastAsiaTheme="minorEastAsia" w:hAnsi="Cambria Math" w:cs="Times New Roman"/>
+          <w:bCs/>
+          <w:sz w:val="28"/>
+          <w:szCs w:val="28"/>
+          <w:lang w:val="en-US"/>
+        </w:rPr>
+        <w:t>y</w:t>
+      </w:r>
+      <w:r>
+        <w:rPr>
+          <w:rFonts w:ascii="Cambria Math" w:eastAsiaTheme="minorEastAsia" w:hAnsi="Cambria Math" w:cs="Times New Roman"/>
+          <w:bCs/>
+          <w:sz w:val="28"/>
+          <w:szCs w:val="28"/>
+        </w:rPr>
+        <w:t xml:space="preserve"> в СКНФ</w:t>
+      </w:r>
+    </w:p>
+    <w:p>
+      <w:pPr>
+        <w:pStyle w:val="a7"/>
+        <w:spacing w:line="360" w:lineRule="auto"/>
+        <w:ind w:left="0"/>
+        <w:jc w:val="center"/>
+        <w:rPr>
+          <w:rFonts w:ascii="Cambria Math" w:eastAsiaTheme="minorEastAsia" w:hAnsi="Cambria Math" w:cs="Times New Roman"/>
+          <w:sz w:val="28"/>
+          <w:szCs w:val="28"/>
+        </w:rPr>
+      </w:pPr>
+      <w:r>
+        <w:rPr>
+          <w:rFonts w:ascii="Cambria Math" w:eastAsiaTheme="minorEastAsia" w:hAnsi="Cambria Math" w:cs="Times New Roman"/>
+          <w:sz w:val="28"/>
+          <w:szCs w:val="28"/>
+        </w:rPr>
+        <w:drawing>
+          <wp:inline distT="0" distB="0" distL="0" distR="0" wp14:anchorId="35BD6B41" wp14:editId="3EC86CF0">
+            <wp:extent cx="5896798" cy="4801270"/>
+            <wp:effectExtent l="0" t="0" r="8890" b="0"/>
+            <wp:docPr id="2" name="Рисунок 2"/>
+            <wp:cNvGraphicFramePr>
+              <a:graphicFrameLocks xmlns:a="http://schemas.openxmlformats.org/drawingml/2006/main" noChangeAspect="1"/>
+            </wp:cNvGraphicFramePr>
+            <a:graphic xmlns:a="http://schemas.openxmlformats.org/drawingml/2006/main">
+              <a:graphicData uri="http://schemas.openxmlformats.org/drawingml/2006/picture">
+                <pic:pic xmlns:pic="http://schemas.openxmlformats.org/drawingml/2006/picture">
+                  <pic:nvPicPr>
+                    <pic:cNvPr id="1" name=""/>
+                    <pic:cNvPicPr/>
+                  </pic:nvPicPr>
+                  <pic:blipFill>
+                    <a:blip r:embed="rId8"/>
+                    <a:stretch>
+                      <a:fillRect/>
+                    </a:stretch>
+                  </pic:blipFill>
+                  <pic:spPr>
+                    <a:xfrm>
+                      <a:off x="0" y="0"/>
+                      <a:ext cx="5896798" cy="4801270"/>
+                    </a:xfrm>
+                    <a:prstGeom prst="rect">
+                      <a:avLst/>
+                    </a:prstGeom>
+                  </pic:spPr>
+                </pic:pic>
+              </a:graphicData>
+            </a:graphic>
+          </wp:inline>
+        </w:drawing>
+      </w:r>
+    </w:p>
+    <w:p>
+      <w:pPr>
+        <w:pStyle w:val="a7"/>
+        <w:spacing w:line="360" w:lineRule="auto"/>
+        <w:ind w:left="0"/>
+        <w:jc w:val="center"/>
+        <w:rPr>
+          <w:rFonts w:ascii="Cambria Math" w:eastAsiaTheme="minorEastAsia" w:hAnsi="Cambria Math" w:cs="Times New Roman"/>
+          <w:sz w:val="28"/>
+          <w:szCs w:val="28"/>
+        </w:rPr>
+      </w:pPr>
+      <w:r>
+        <w:rPr>
+          <w:rFonts w:ascii="Cambria Math" w:eastAsiaTheme="minorEastAsia" w:hAnsi="Cambria Math" w:cs="Times New Roman"/>
+          <w:sz w:val="28"/>
+          <w:szCs w:val="28"/>
+        </w:rPr>
+        <w:t xml:space="preserve">Рисунок 3 – Схема функции </w:t>
+      </w:r>
+      <w:r>
+        <w:rPr>
+          <w:rFonts w:ascii="Cambria Math" w:eastAsiaTheme="minorEastAsia" w:hAnsi="Cambria Math" w:cs="Times New Roman"/>
+          <w:sz w:val="28"/>
+          <w:szCs w:val="28"/>
+          <w:lang w:val="en-US"/>
+        </w:rPr>
+        <w:t>y</w:t>
+      </w:r>
+      <w:r>
+        <w:rPr>
+          <w:rFonts w:ascii="Cambria Math" w:eastAsiaTheme="minorEastAsia" w:hAnsi="Cambria Math" w:cs="Times New Roman"/>
+          <w:sz w:val="28"/>
+          <w:szCs w:val="28"/>
+        </w:rPr>
+        <w:t xml:space="preserve"> </w:t>
+      </w:r>
+      <w:r>
+        <w:rPr>
+          <w:rFonts w:ascii="Cambria Math" w:eastAsiaTheme="minorEastAsia" w:hAnsi="Cambria Math" w:cs="Times New Roman"/>
+          <w:sz w:val="28"/>
+          <w:szCs w:val="28"/>
+        </w:rPr>
+        <w:t>в СКНФ</w:t>
+      </w:r>
+    </w:p>
     <w:sectPr>
-      <w:footerReference w:type="default" r:id="rId7"/>
+      <w:footerReference w:type="default" r:id="rId9"/>
       <w:pgSz w:w="11906" w:h="16838"/>
       <w:pgMar w:top="1134" w:right="850" w:bottom="1134" w:left="1701" w:header="708" w:footer="708" w:gutter="0"/>
       <w:cols w:space="708"/>
@@ -7386,7 +7701,6 @@
   <w:style w:type="character" w:default="1" w:styleId="a0">
     <w:name w:val="Default Paragraph Font"/>
     <w:uiPriority w:val="1"/>
-    <w:semiHidden/>
     <w:unhideWhenUsed/>
   </w:style>
   <w:style w:type="table" w:default="1" w:styleId="a1">

</xml_diff>